<commit_message>
Fix Wira: Blueprint → Borneo Hackathon across all files
</commit_message>
<xml_diff>
--- a/Chye_Yan_Tong_Resume_2026.docx
+++ b/Chye_Yan_Tong_Resume_2026.docx
@@ -649,7 +649,57 @@
                 <w:rFonts w:ascii="Calibri" w:hAnsi="Calibri"/>
                 <w:sz w:val="19"/>
               </w:rPr>
-              <w:t>LUNA Women's Safety App &amp; Wira Disaster Resilience Platform</w:t>
+              <w:t>LUNA Women's Safety App</w:t>
+            </w:r>
+          </w:p>
+        </w:tc>
+        <w:tc>
+          <w:tcPr>
+            <w:tcW w:type="dxa" w:w="720"/>
+          </w:tcPr>
+          <w:p>
+            <w:r/>
+            <w:r>
+              <w:rPr>
+                <w:rFonts w:ascii="Calibri" w:hAnsi="Calibri"/>
+                <w:color w:val="555555"/>
+                <w:sz w:val="19"/>
+              </w:rPr>
+              <w:t>2026</w:t>
+            </w:r>
+          </w:p>
+        </w:tc>
+      </w:tr>
+      <w:tr>
+        <w:tc>
+          <w:tcPr>
+            <w:tcW w:type="dxa" w:w="3168"/>
+          </w:tcPr>
+          <w:p>
+            <w:r/>
+            <w:r>
+              <w:rPr>
+                <w:rFonts w:ascii="Calibri" w:hAnsi="Calibri"/>
+                <w:b/>
+                <w:sz w:val="19"/>
+              </w:rPr>
+              <w:t>Borneo Hackathon</w:t>
+            </w:r>
+          </w:p>
+        </w:tc>
+        <w:tc>
+          <w:tcPr>
+            <w:tcW w:type="dxa" w:w="6480"/>
+          </w:tcPr>
+          <w:p>
+            <w:r>
+              <w:t>Wira Disaster Resilience Platform</w:t>
+            </w:r>
+            <w:r>
+              <w:rPr>
+                <w:rFonts w:ascii="Calibri" w:hAnsi="Calibri"/>
+                <w:sz w:val="19"/>
+              </w:rPr>
             </w:r>
           </w:p>
         </w:tc>
@@ -919,7 +969,7 @@
           <w:color w:val="1A3C6E"/>
           <w:sz w:val="21"/>
         </w:rPr>
-        <w:t>Wira — AI Disaster Resilience Platform  |  Blueprint Hackathon Finalist</w:t>
+        <w:t>Wira — AI Disaster Resilience Platform  |  Borneo Hackathon</w:t>
       </w:r>
     </w:p>
     <w:p>

</xml_diff>